<commit_message>
Updated submission pack and map
Co-Authored-By: Claude Sonnet 5.5 <noreply@anthropic.com>
</commit_message>
<xml_diff>
--- a/docs/Case03_Aangan_Submission.docx
+++ b/docs/Case03_Aangan_Submission.docx
@@ -31,7 +31,7 @@
         <w:rPr>
           <w:b w:val="0"/>
         </w:rPr>
-        <w:t>Dashboard: https://aangan-desk.vercel.app/dashboard   ·   Full write-up: https://aangan-desk.vercel.app/brief</w:t>
+        <w:t>Dashboard: https://aangan-desk.vercel.app/dashboard · How it connects (incl. HubSpot explained): https://aangan-desk.vercel.app/connect · Full write-up: https://aangan-desk.vercel.app/brief</w:t>
       </w:r>
     </w:p>
     <w:p>
@@ -39,7 +39,7 @@
         <w:rPr>
           <w:b w:val="0"/>
         </w:rPr>
-        <w:t>Code (public): https://github.com/nawazalam4u/aangan-desk</w:t>
+        <w:t>Code (public): https://github.com/nawazalam4u/aangan-desk (linked to Vercel: every push redeploys)</w:t>
       </w:r>
     </w:p>
     <w:p>
@@ -47,7 +47,7 @@
         <w:rPr>
           <w:b w:val="0"/>
         </w:rPr>
-        <w:t>Try it: open the live app, press a scenario button (for example "Qualified home") and watch the call, the five checks and the Telegram handoff note appear.</w:t>
+        <w:t>Try it: open the live app and press a scenario button, for example "Qualified home". Watch the call, the five checks and the Telegram handoff note appear. The caller language can be English, Hindi or Marathi.</w:t>
       </w:r>
     </w:p>
     <w:p>
@@ -119,7 +119,7 @@
         <w:pStyle w:val="ListBullet"/>
       </w:pPr>
       <w:r>
-        <w:t>Every qualified lead reaches a designer in under 5 minutes with all the basics, so no repeat questions</w:t>
+        <w:t>Every qualified lead reaches a designer, and the CRM, in under 5 minutes with all the basics, so no repeat questions</w:t>
       </w:r>
     </w:p>
     <w:p>
@@ -175,7 +175,7 @@
         <w:pStyle w:val="ListNumber"/>
       </w:pPr>
       <w:r>
-        <w:t>Notes are inconsistent: T16 "I don't see a note"; T07 no name or number taken.</w:t>
+        <w:t>Notes are inconsistent: T16 'I don't see a note'; T07 no name or number taken.</w:t>
       </w:r>
     </w:p>
     <w:p>
@@ -344,7 +344,7 @@
           </w:tcPr>
           <w:p>
             <w:r>
-              <w:t>40 transcripts, services.md, qualified.md and pricing.md exist today. Caveat: the live phone line (number, telephony, speech) is an integration not included in the demo, which uses the browser microphone.</w:t>
+              <w:t>The 40 transcripts, services.md, qualified.md and pricing.md exist today. Caveat: the live phone line (number, telephony, speech) is an integration not included in the demo, which uses the browser microphone.</w:t>
             </w:r>
           </w:p>
         </w:tc>
@@ -376,7 +376,7 @@
           </w:tcPr>
           <w:p>
             <w:r>
-              <w:t>Designers act on a complete note; Nikhil acts on the dashboard; callers get an answer at 11pm instead of nothing.</w:t>
+              <w:t>Designers act on a complete note; the sales team works the lead in HubSpot; Nikhil acts on the dashboard; callers get an answer at 11pm instead of nothing.</w:t>
             </w:r>
           </w:p>
         </w:tc>
@@ -579,7 +579,7 @@
         <w:rPr>
           <w:b w:val="0"/>
         </w:rPr>
-        <w:t>Enforced in code, not only in a prompt: every reply passes a filter that blocks rupee figures, "lakh", "per sq ft" and similar. In testing, 6 of 6 leak attempts were blocked and three live tricks on the real AI produced no price.</w:t>
+        <w:t>Enforced in code, not only in a prompt: every reply passes a filter that blocks rupee figures, "lakh", "per sq ft" and the Hindi/Marathi equivalents. In testing, every leak attempt was blocked and three live tricks on the real AI produced no price.</w:t>
       </w:r>
     </w:p>
     <w:p>
@@ -602,7 +602,7 @@
       <w:r>
         <w:drawing>
           <wp:inline xmlns:a="http://schemas.openxmlformats.org/drawingml/2006/main" xmlns:pic="http://schemas.openxmlformats.org/drawingml/2006/picture">
-            <wp:extent cx="6309360" cy="3979750"/>
+            <wp:extent cx="6309360" cy="4756287"/>
             <wp:docPr id="1" name="Picture 1"/>
             <wp:cNvGraphicFramePr>
               <a:graphicFrameLocks noChangeAspect="1"/>
@@ -623,7 +623,7 @@
                   <pic:spPr>
                     <a:xfrm>
                       <a:off x="0" y="0"/>
-                      <a:ext cx="6309360" cy="3979750"/>
+                      <a:ext cx="6309360" cy="4756287"/>
                     </a:xfrm>
                     <a:prstGeom prst="rect"/>
                   </pic:spPr>
@@ -639,6 +639,30 @@
         <w:pStyle w:val="Heading1"/>
       </w:pPr>
       <w:r>
+        <w:t>Why HubSpot is part of this project</w:t>
+      </w:r>
+    </w:p>
+    <w:p>
+      <w:r>
+        <w:rPr>
+          <w:b w:val="0"/>
+        </w:rPr>
+        <w:t>HubSpot is the CRM: the system of record for each lead after the call. The assistant writes every qualified, call-back or escalated lead into HubSpot as a contact (matched on phone number so a repeat caller is one record), with the full handoff note on its timeline, a call-back task, and a deal in the first pipeline stage. Designers and Nikhil then work the relationship in HubSpot and move the deal toward won or lost.</w:t>
+      </w:r>
+    </w:p>
+    <w:p>
+      <w:r>
+        <w:rPr>
+          <w:b w:val="0"/>
+        </w:rPr>
+        <w:t>Our own database and dashboard answer a different question: how is the phone assistant performing (volume, speed, cost)? HubSpot answers: what is happening with each customer? Callers who are not a fit are never sent to the CRM, no price is ever written to it, and if HubSpot is down the call, the Telegram note and the dashboard still work.</w:t>
+      </w:r>
+    </w:p>
+    <w:p>
+      <w:pPr>
+        <w:pStyle w:val="Heading1"/>
+      </w:pPr>
+      <w:r>
         <w:t>Telegram or email for the handoff?</w:t>
       </w:r>
     </w:p>
@@ -647,7 +671,7 @@
         <w:rPr>
           <w:b w:val="0"/>
         </w:rPr>
-        <w:t>Telegram, with the database as the permanent record. A push alert reaches a designer on site within the 5-minute promise; the "I'll take it" button stops two designers calling the same person and the claim time is measured; no designer-specialty data exists so a shared group beats picking an inbox; a bot is free and instant with no spam-folder risk. Weakness covered: Telegram is not a system of record, so every note is also stored in the database; the group must be private because it contains callers' numbers. I would switch to email if designers will not install Telegram or compliance requires it.</w:t>
+        <w:t>Telegram, with the database and HubSpot as the permanent record. A push alert reaches a designer on site within the 5-minute promise; the "I'll take it" button stops two designers calling the same person and the claim time is measured; no designer-specialty data exists so a shared group beats picking an inbox; a bot is free and instant with no spam-folder risk. Weakness covered: Telegram is not a system of record, so every note is also stored in the database; the group must be private because it contains callers' numbers. I would switch to email if designers will not install Telegram or compliance requires it.</w:t>
       </w:r>
     </w:p>
     <w:p>
@@ -671,7 +695,7 @@
         <w:pStyle w:val="ListBullet"/>
       </w:pPr>
       <w:r>
-        <w:t>A real phone number is not included: it needs telephony, KYC and speech in English, Hindi and Marathi. The demo runs the full logic through the browser microphone; a provider replaces only the voice layer.</w:t>
+        <w:t>A real phone number is not included: it needs telephony, KYC and speech. The demo runs the full logic through the browser microphone; a provider replaces only the voice layer.</w:t>
       </w:r>
     </w:p>
     <w:p>
@@ -711,7 +735,7 @@
         <w:pStyle w:val="ListBullet"/>
       </w:pPr>
       <w:r>
-        <w:t>The 5-minute promise stops at Telegram if no designer claims the lead; next step is an automatic nudge after 15 minutes.</w:t>
+        <w:t>The 5-minute promise stops at Telegram if no designer claims the lead; the dashboard now flags any lead unclaimed after 15 minutes.</w:t>
       </w:r>
     </w:p>
     <w:p>
@@ -751,7 +775,7 @@
         <w:pStyle w:val="ListBullet"/>
       </w:pPr>
       <w:r>
-        <w:t>The same enquiries through the real AI (Gemini 3.1 Flash-Lite): 39 of 39 testable agree. Two real errors were found and fixed (an office wrongly called out of scope; a possession date read as a deadline) and a safety net was added so the AI cannot close a lead without the caller's words backing it.</w:t>
+        <w:t>The same enquiries through the real AI (Gemini 3.1 Flash-Lite): 39 of 39 testable agree. Two real errors were found and fixed (an office wrongly called out of scope; a possession date read as a deadline) and a safety net was added so the AI cannot close a lead without the caller's own words backing it.</w:t>
       </w:r>
     </w:p>
     <w:p>
@@ -759,7 +783,7 @@
         <w:pStyle w:val="ListBullet"/>
       </w:pPr>
       <w:r>
-        <w:t>All 9 demo calls pass on the live AI, run twice. Price-leak attacks: 0 leaks.</w:t>
+        <w:t>All 9 demo calls pass on the live AI, run twice; Hindi and Marathi calls tested (including a Hindi complaint that escalates). Price-leak attacks: 0 leaks.</w:t>
       </w:r>
     </w:p>
     <w:p>
@@ -767,7 +791,15 @@
         <w:pStyle w:val="ListBullet"/>
       </w:pPr>
       <w:r>
-        <w:t>Live deployment tested end to end: call, handoff note to Telegram, record in the Neon database, protected dashboard.</w:t>
+        <w:t>HubSpot sync tested against a simulated HubSpot (contact created once, repeat caller matched, note, task and deal sent correctly); to be confirmed against a real account.</w:t>
+      </w:r>
+    </w:p>
+    <w:p>
+      <w:pPr>
+        <w:pStyle w:val="ListBullet"/>
+      </w:pPr>
+      <w:r>
+        <w:t>Live deployment tested end to end: call, handoff note to Telegram, record in the Neon database, protected dashboard, auto-deploy from GitHub.</w:t>
       </w:r>
     </w:p>
     <w:p>
@@ -783,7 +815,7 @@
         <w:rPr>
           <w:b w:val="0"/>
         </w:rPr>
-        <w:t>The rules engine, price guardrail, note and dashboard are channel-free. A WhatsApp message would call the same turn endpoint and the form is a single-shot version of the same extraction. All 10 WhatsApp and 10 form enquiries were already run through the rules as a test. In September, 2 of 10 WhatsApp threads sat unanswered for 2-4 days, 5 more waited 16+ hours, and the form enquiries have no recorded response times.</w:t>
+        <w:t>The rules engine, price guardrail, note, CRM sync and dashboard are channel-free. A WhatsApp message would call the same turn endpoint and the form is a single-shot version of the same extraction. All 10 WhatsApp and 10 form enquiries were already run through the rules as a test. In September, 2 of 10 WhatsApp threads sat unanswered for 2-4 days, 5 more waited 16+ hours, and the form enquiries have no recorded response times.</w:t>
       </w:r>
     </w:p>
     <w:sectPr>

</xml_diff>